<commit_message>
Integración completa del chatbot con gemini gemini-3.5-flash-lite y mejoras en la interfaz
</commit_message>
<xml_diff>
--- a/chatbot/backend/data/ACERCAMIENTO EMPRESARIAL (1).docx
+++ b/chatbot/backend/data/ACERCAMIENTO EMPRESARIAL (1).docx
@@ -5,16 +5,12 @@
     <w:p>
       <w:pPr>
         <w:rPr>
-          <w:b/>
-          <w:bCs/>
-          <w:sz w:val="24"/>
-          <w:szCs w:val="24"/>
-        </w:rPr>
-      </w:pPr>
-      <w:r>
-        <w:rPr>
-          <w:b/>
-          <w:bCs/>
+          <w:sz w:val="24"/>
+          <w:szCs w:val="24"/>
+        </w:rPr>
+      </w:pPr>
+      <w:r>
+        <w:rPr>
           <w:sz w:val="24"/>
           <w:szCs w:val="24"/>
         </w:rPr>
@@ -24,26 +20,20 @@
     <w:p>
       <w:pPr>
         <w:rPr>
-          <w:b/>
-          <w:bCs/>
-          <w:sz w:val="24"/>
-          <w:szCs w:val="24"/>
-        </w:rPr>
-      </w:pPr>
-    </w:p>
-    <w:p>
-      <w:pPr>
-        <w:rPr>
-          <w:b/>
-          <w:bCs/>
-          <w:sz w:val="24"/>
-          <w:szCs w:val="24"/>
-        </w:rPr>
-      </w:pPr>
-      <w:r>
-        <w:rPr>
-          <w:b/>
-          <w:bCs/>
+          <w:sz w:val="24"/>
+          <w:szCs w:val="24"/>
+        </w:rPr>
+      </w:pPr>
+    </w:p>
+    <w:p>
+      <w:pPr>
+        <w:rPr>
+          <w:sz w:val="24"/>
+          <w:szCs w:val="24"/>
+        </w:rPr>
+      </w:pPr>
+      <w:r>
+        <w:rPr>
           <w:sz w:val="24"/>
           <w:szCs w:val="24"/>
         </w:rPr>
@@ -53,16 +43,12 @@
     <w:p>
       <w:pPr>
         <w:rPr>
-          <w:b/>
-          <w:bCs/>
-          <w:sz w:val="24"/>
-          <w:szCs w:val="24"/>
-        </w:rPr>
-      </w:pPr>
-      <w:r>
-        <w:rPr>
-          <w:b/>
-          <w:bCs/>
+          <w:sz w:val="24"/>
+          <w:szCs w:val="24"/>
+        </w:rPr>
+      </w:pPr>
+      <w:r>
+        <w:rPr>
           <w:sz w:val="24"/>
           <w:szCs w:val="24"/>
         </w:rPr>
@@ -72,26 +58,20 @@
     <w:p>
       <w:pPr>
         <w:rPr>
-          <w:b/>
-          <w:bCs/>
-          <w:sz w:val="24"/>
-          <w:szCs w:val="24"/>
-        </w:rPr>
-      </w:pPr>
-    </w:p>
-    <w:p>
-      <w:pPr>
-        <w:rPr>
-          <w:b/>
-          <w:bCs/>
-          <w:sz w:val="24"/>
-          <w:szCs w:val="24"/>
-        </w:rPr>
-      </w:pPr>
-      <w:r>
-        <w:rPr>
-          <w:b/>
-          <w:bCs/>
+          <w:sz w:val="24"/>
+          <w:szCs w:val="24"/>
+        </w:rPr>
+      </w:pPr>
+    </w:p>
+    <w:p>
+      <w:pPr>
+        <w:rPr>
+          <w:sz w:val="24"/>
+          <w:szCs w:val="24"/>
+        </w:rPr>
+      </w:pPr>
+      <w:r>
+        <w:rPr>
           <w:sz w:val="24"/>
           <w:szCs w:val="24"/>
         </w:rPr>
@@ -101,26 +81,20 @@
     <w:p>
       <w:pPr>
         <w:rPr>
-          <w:b/>
-          <w:bCs/>
-          <w:sz w:val="24"/>
-          <w:szCs w:val="24"/>
-        </w:rPr>
-      </w:pPr>
-    </w:p>
-    <w:p>
-      <w:pPr>
-        <w:rPr>
-          <w:b/>
-          <w:bCs/>
-          <w:sz w:val="24"/>
-          <w:szCs w:val="24"/>
-        </w:rPr>
-      </w:pPr>
-      <w:r>
-        <w:rPr>
-          <w:b/>
-          <w:bCs/>
+          <w:sz w:val="24"/>
+          <w:szCs w:val="24"/>
+        </w:rPr>
+      </w:pPr>
+    </w:p>
+    <w:p>
+      <w:pPr>
+        <w:rPr>
+          <w:sz w:val="24"/>
+          <w:szCs w:val="24"/>
+        </w:rPr>
+      </w:pPr>
+      <w:r>
+        <w:rPr>
           <w:sz w:val="24"/>
           <w:szCs w:val="24"/>
         </w:rPr>
@@ -130,16 +104,12 @@
     <w:p>
       <w:pPr>
         <w:rPr>
-          <w:b/>
-          <w:bCs/>
-          <w:sz w:val="24"/>
-          <w:szCs w:val="24"/>
-        </w:rPr>
-      </w:pPr>
-      <w:r>
-        <w:rPr>
-          <w:b/>
-          <w:bCs/>
+          <w:sz w:val="24"/>
+          <w:szCs w:val="24"/>
+        </w:rPr>
+      </w:pPr>
+      <w:r>
+        <w:rPr>
           <w:sz w:val="24"/>
           <w:szCs w:val="24"/>
         </w:rPr>
@@ -149,16 +119,12 @@
     <w:p>
       <w:pPr>
         <w:rPr>
-          <w:b/>
-          <w:bCs/>
-          <w:sz w:val="24"/>
-          <w:szCs w:val="24"/>
-        </w:rPr>
-      </w:pPr>
-      <w:r>
-        <w:rPr>
-          <w:b/>
-          <w:bCs/>
+          <w:sz w:val="24"/>
+          <w:szCs w:val="24"/>
+        </w:rPr>
+      </w:pPr>
+      <w:r>
+        <w:rPr>
           <w:sz w:val="24"/>
           <w:szCs w:val="24"/>
         </w:rPr>
@@ -168,16 +134,12 @@
     <w:p>
       <w:pPr>
         <w:rPr>
-          <w:b/>
-          <w:bCs/>
-          <w:sz w:val="24"/>
-          <w:szCs w:val="24"/>
-        </w:rPr>
-      </w:pPr>
-      <w:r>
-        <w:rPr>
-          <w:b/>
-          <w:bCs/>
+          <w:sz w:val="24"/>
+          <w:szCs w:val="24"/>
+        </w:rPr>
+      </w:pPr>
+      <w:r>
+        <w:rPr>
           <w:sz w:val="24"/>
           <w:szCs w:val="24"/>
         </w:rPr>
@@ -187,16 +149,12 @@
     <w:p>
       <w:pPr>
         <w:rPr>
-          <w:b/>
-          <w:bCs/>
-          <w:sz w:val="24"/>
-          <w:szCs w:val="24"/>
-        </w:rPr>
-      </w:pPr>
-      <w:r>
-        <w:rPr>
-          <w:b/>
-          <w:bCs/>
+          <w:sz w:val="24"/>
+          <w:szCs w:val="24"/>
+        </w:rPr>
+      </w:pPr>
+      <w:r>
+        <w:rPr>
           <w:sz w:val="24"/>
           <w:szCs w:val="24"/>
         </w:rPr>
@@ -206,16 +164,12 @@
     <w:p>
       <w:pPr>
         <w:rPr>
-          <w:b/>
-          <w:bCs/>
-          <w:sz w:val="24"/>
-          <w:szCs w:val="24"/>
-        </w:rPr>
-      </w:pPr>
-      <w:r>
-        <w:rPr>
-          <w:b/>
-          <w:bCs/>
+          <w:sz w:val="24"/>
+          <w:szCs w:val="24"/>
+        </w:rPr>
+      </w:pPr>
+      <w:r>
+        <w:rPr>
           <w:sz w:val="24"/>
           <w:szCs w:val="24"/>
         </w:rPr>
@@ -225,16 +179,12 @@
     <w:p>
       <w:pPr>
         <w:rPr>
-          <w:b/>
-          <w:bCs/>
-          <w:sz w:val="24"/>
-          <w:szCs w:val="24"/>
-        </w:rPr>
-      </w:pPr>
-      <w:r>
-        <w:rPr>
-          <w:b/>
-          <w:bCs/>
+          <w:sz w:val="24"/>
+          <w:szCs w:val="24"/>
+        </w:rPr>
+      </w:pPr>
+      <w:r>
+        <w:rPr>
           <w:sz w:val="24"/>
           <w:szCs w:val="24"/>
         </w:rPr>
@@ -244,26 +194,20 @@
     <w:p>
       <w:pPr>
         <w:rPr>
-          <w:b/>
-          <w:bCs/>
-          <w:sz w:val="24"/>
-          <w:szCs w:val="24"/>
-        </w:rPr>
-      </w:pPr>
-    </w:p>
-    <w:p>
-      <w:pPr>
-        <w:rPr>
-          <w:b/>
-          <w:bCs/>
-          <w:sz w:val="24"/>
-          <w:szCs w:val="24"/>
-        </w:rPr>
-      </w:pPr>
-      <w:r>
-        <w:rPr>
-          <w:b/>
-          <w:bCs/>
+          <w:sz w:val="24"/>
+          <w:szCs w:val="24"/>
+        </w:rPr>
+      </w:pPr>
+    </w:p>
+    <w:p>
+      <w:pPr>
+        <w:rPr>
+          <w:sz w:val="24"/>
+          <w:szCs w:val="24"/>
+        </w:rPr>
+      </w:pPr>
+      <w:r>
+        <w:rPr>
           <w:sz w:val="24"/>
           <w:szCs w:val="24"/>
         </w:rPr>
@@ -273,16 +217,12 @@
     <w:p>
       <w:pPr>
         <w:rPr>
-          <w:b/>
-          <w:bCs/>
-          <w:sz w:val="24"/>
-          <w:szCs w:val="24"/>
-        </w:rPr>
-      </w:pPr>
-      <w:r>
-        <w:rPr>
-          <w:b/>
-          <w:bCs/>
+          <w:sz w:val="24"/>
+          <w:szCs w:val="24"/>
+        </w:rPr>
+      </w:pPr>
+      <w:r>
+        <w:rPr>
           <w:sz w:val="24"/>
           <w:szCs w:val="24"/>
         </w:rPr>
@@ -292,26 +232,20 @@
     <w:p>
       <w:pPr>
         <w:rPr>
-          <w:b/>
-          <w:bCs/>
-          <w:sz w:val="24"/>
-          <w:szCs w:val="24"/>
-        </w:rPr>
-      </w:pPr>
-    </w:p>
-    <w:p>
-      <w:pPr>
-        <w:rPr>
-          <w:b/>
-          <w:bCs/>
-          <w:sz w:val="24"/>
-          <w:szCs w:val="24"/>
-        </w:rPr>
-      </w:pPr>
-      <w:r>
-        <w:rPr>
-          <w:b/>
-          <w:bCs/>
+          <w:sz w:val="24"/>
+          <w:szCs w:val="24"/>
+        </w:rPr>
+      </w:pPr>
+    </w:p>
+    <w:p>
+      <w:pPr>
+        <w:rPr>
+          <w:sz w:val="24"/>
+          <w:szCs w:val="24"/>
+        </w:rPr>
+      </w:pPr>
+      <w:r>
+        <w:rPr>
           <w:sz w:val="24"/>
           <w:szCs w:val="24"/>
         </w:rPr>
@@ -321,16 +255,12 @@
     <w:p>
       <w:pPr>
         <w:rPr>
-          <w:b/>
-          <w:bCs/>
-          <w:sz w:val="24"/>
-          <w:szCs w:val="24"/>
-        </w:rPr>
-      </w:pPr>
-      <w:r>
-        <w:rPr>
-          <w:b/>
-          <w:bCs/>
+          <w:sz w:val="24"/>
+          <w:szCs w:val="24"/>
+        </w:rPr>
+      </w:pPr>
+      <w:r>
+        <w:rPr>
           <w:sz w:val="24"/>
           <w:szCs w:val="24"/>
         </w:rPr>
@@ -340,16 +270,12 @@
     <w:p>
       <w:pPr>
         <w:rPr>
-          <w:b/>
-          <w:bCs/>
-          <w:sz w:val="24"/>
-          <w:szCs w:val="24"/>
-        </w:rPr>
-      </w:pPr>
-      <w:r>
-        <w:rPr>
-          <w:b/>
-          <w:bCs/>
+          <w:sz w:val="24"/>
+          <w:szCs w:val="24"/>
+        </w:rPr>
+      </w:pPr>
+      <w:r>
+        <w:rPr>
           <w:sz w:val="24"/>
           <w:szCs w:val="24"/>
         </w:rPr>
@@ -359,16 +285,12 @@
     <w:p>
       <w:pPr>
         <w:rPr>
-          <w:b/>
-          <w:bCs/>
-          <w:sz w:val="24"/>
-          <w:szCs w:val="24"/>
-        </w:rPr>
-      </w:pPr>
-      <w:r>
-        <w:rPr>
-          <w:b/>
-          <w:bCs/>
+          <w:sz w:val="24"/>
+          <w:szCs w:val="24"/>
+        </w:rPr>
+      </w:pPr>
+      <w:r>
+        <w:rPr>
           <w:sz w:val="24"/>
           <w:szCs w:val="24"/>
         </w:rPr>
@@ -378,16 +300,12 @@
     <w:p>
       <w:pPr>
         <w:rPr>
-          <w:b/>
-          <w:bCs/>
-          <w:sz w:val="24"/>
-          <w:szCs w:val="24"/>
-        </w:rPr>
-      </w:pPr>
-      <w:r>
-        <w:rPr>
-          <w:b/>
-          <w:bCs/>
+          <w:sz w:val="24"/>
+          <w:szCs w:val="24"/>
+        </w:rPr>
+      </w:pPr>
+      <w:r>
+        <w:rPr>
           <w:sz w:val="24"/>
           <w:szCs w:val="24"/>
         </w:rPr>
@@ -397,46 +315,35 @@
     <w:p>
       <w:pPr>
         <w:rPr>
-          <w:b/>
-          <w:bCs/>
-          <w:sz w:val="24"/>
-          <w:szCs w:val="24"/>
-        </w:rPr>
-      </w:pPr>
-      <w:r>
-        <w:rPr>
-          <w:b/>
-          <w:bCs/>
-          <w:sz w:val="24"/>
-          <w:szCs w:val="24"/>
-        </w:rPr>
-        <w:lastRenderedPageBreak/>
+          <w:sz w:val="24"/>
+          <w:szCs w:val="24"/>
+        </w:rPr>
+      </w:pPr>
+      <w:r>
+        <w:rPr>
+          <w:sz w:val="24"/>
+          <w:szCs w:val="24"/>
+        </w:rPr>
         <w:t>* **Según su necesidad de personal:** Empresas con necesidad de contratar personal de forma actual e inmediata, o empresas que prevean contratar personal en los próximos meses (demanda futura).</w:t>
       </w:r>
     </w:p>
     <w:p>
       <w:pPr>
         <w:rPr>
-          <w:b/>
-          <w:bCs/>
-          <w:sz w:val="24"/>
-          <w:szCs w:val="24"/>
-        </w:rPr>
-      </w:pPr>
-    </w:p>
-    <w:p>
-      <w:pPr>
-        <w:rPr>
-          <w:b/>
-          <w:bCs/>
-          <w:sz w:val="24"/>
-          <w:szCs w:val="24"/>
-        </w:rPr>
-      </w:pPr>
-      <w:r>
-        <w:rPr>
-          <w:b/>
-          <w:bCs/>
+          <w:sz w:val="24"/>
+          <w:szCs w:val="24"/>
+        </w:rPr>
+      </w:pPr>
+    </w:p>
+    <w:p>
+      <w:pPr>
+        <w:rPr>
+          <w:sz w:val="24"/>
+          <w:szCs w:val="24"/>
+        </w:rPr>
+      </w:pPr>
+      <w:r>
+        <w:rPr>
           <w:sz w:val="24"/>
           <w:szCs w:val="24"/>
         </w:rPr>
@@ -446,16 +353,12 @@
     <w:p>
       <w:pPr>
         <w:rPr>
-          <w:b/>
-          <w:bCs/>
-          <w:sz w:val="24"/>
-          <w:szCs w:val="24"/>
-        </w:rPr>
-      </w:pPr>
-      <w:r>
-        <w:rPr>
-          <w:b/>
-          <w:bCs/>
+          <w:sz w:val="24"/>
+          <w:szCs w:val="24"/>
+        </w:rPr>
+      </w:pPr>
+      <w:r>
+        <w:rPr>
           <w:sz w:val="24"/>
           <w:szCs w:val="24"/>
         </w:rPr>
@@ -465,16 +368,12 @@
     <w:p>
       <w:pPr>
         <w:rPr>
-          <w:b/>
-          <w:bCs/>
-          <w:sz w:val="24"/>
-          <w:szCs w:val="24"/>
-        </w:rPr>
-      </w:pPr>
-      <w:r>
-        <w:rPr>
-          <w:b/>
-          <w:bCs/>
+          <w:sz w:val="24"/>
+          <w:szCs w:val="24"/>
+        </w:rPr>
+      </w:pPr>
+      <w:r>
+        <w:rPr>
           <w:sz w:val="24"/>
           <w:szCs w:val="24"/>
         </w:rPr>
@@ -484,16 +383,12 @@
     <w:p>
       <w:pPr>
         <w:rPr>
-          <w:b/>
-          <w:bCs/>
-          <w:sz w:val="24"/>
-          <w:szCs w:val="24"/>
-        </w:rPr>
-      </w:pPr>
-      <w:r>
-        <w:rPr>
-          <w:b/>
-          <w:bCs/>
+          <w:sz w:val="24"/>
+          <w:szCs w:val="24"/>
+        </w:rPr>
+      </w:pPr>
+      <w:r>
+        <w:rPr>
           <w:sz w:val="24"/>
           <w:szCs w:val="24"/>
         </w:rPr>
@@ -503,16 +398,12 @@
     <w:p>
       <w:pPr>
         <w:rPr>
-          <w:b/>
-          <w:bCs/>
-          <w:sz w:val="24"/>
-          <w:szCs w:val="24"/>
-        </w:rPr>
-      </w:pPr>
-      <w:r>
-        <w:rPr>
-          <w:b/>
-          <w:bCs/>
+          <w:sz w:val="24"/>
+          <w:szCs w:val="24"/>
+        </w:rPr>
+      </w:pPr>
+      <w:r>
+        <w:rPr>
           <w:sz w:val="24"/>
           <w:szCs w:val="24"/>
         </w:rPr>
@@ -522,26 +413,20 @@
     <w:p>
       <w:pPr>
         <w:rPr>
-          <w:b/>
-          <w:bCs/>
-          <w:sz w:val="24"/>
-          <w:szCs w:val="24"/>
-        </w:rPr>
-      </w:pPr>
-    </w:p>
-    <w:p>
-      <w:pPr>
-        <w:rPr>
-          <w:b/>
-          <w:bCs/>
-          <w:sz w:val="24"/>
-          <w:szCs w:val="24"/>
-        </w:rPr>
-      </w:pPr>
-      <w:r>
-        <w:rPr>
-          <w:b/>
-          <w:bCs/>
+          <w:sz w:val="24"/>
+          <w:szCs w:val="24"/>
+        </w:rPr>
+      </w:pPr>
+    </w:p>
+    <w:p>
+      <w:pPr>
+        <w:rPr>
+          <w:sz w:val="24"/>
+          <w:szCs w:val="24"/>
+        </w:rPr>
+      </w:pPr>
+      <w:r>
+        <w:rPr>
           <w:sz w:val="24"/>
           <w:szCs w:val="24"/>
         </w:rPr>
@@ -551,16 +436,12 @@
     <w:p>
       <w:pPr>
         <w:rPr>
-          <w:b/>
-          <w:bCs/>
-          <w:sz w:val="24"/>
-          <w:szCs w:val="24"/>
-        </w:rPr>
-      </w:pPr>
-      <w:r>
-        <w:rPr>
-          <w:b/>
-          <w:bCs/>
+          <w:sz w:val="24"/>
+          <w:szCs w:val="24"/>
+        </w:rPr>
+      </w:pPr>
+      <w:r>
+        <w:rPr>
           <w:sz w:val="24"/>
           <w:szCs w:val="24"/>
         </w:rPr>
@@ -570,26 +451,20 @@
     <w:p>
       <w:pPr>
         <w:rPr>
-          <w:b/>
-          <w:bCs/>
-          <w:sz w:val="24"/>
-          <w:szCs w:val="24"/>
-        </w:rPr>
-      </w:pPr>
-    </w:p>
-    <w:p>
-      <w:pPr>
-        <w:rPr>
-          <w:b/>
-          <w:bCs/>
-          <w:sz w:val="24"/>
-          <w:szCs w:val="24"/>
-        </w:rPr>
-      </w:pPr>
-      <w:r>
-        <w:rPr>
-          <w:b/>
-          <w:bCs/>
+          <w:sz w:val="24"/>
+          <w:szCs w:val="24"/>
+        </w:rPr>
+      </w:pPr>
+    </w:p>
+    <w:p>
+      <w:pPr>
+        <w:rPr>
+          <w:sz w:val="24"/>
+          <w:szCs w:val="24"/>
+        </w:rPr>
+      </w:pPr>
+      <w:r>
+        <w:rPr>
           <w:sz w:val="24"/>
           <w:szCs w:val="24"/>
         </w:rPr>
@@ -599,16 +474,12 @@
     <w:p>
       <w:pPr>
         <w:rPr>
-          <w:b/>
-          <w:bCs/>
-          <w:sz w:val="24"/>
-          <w:szCs w:val="24"/>
-        </w:rPr>
-      </w:pPr>
-      <w:r>
-        <w:rPr>
-          <w:b/>
-          <w:bCs/>
+          <w:sz w:val="24"/>
+          <w:szCs w:val="24"/>
+        </w:rPr>
+      </w:pPr>
+      <w:r>
+        <w:rPr>
           <w:sz w:val="24"/>
           <w:szCs w:val="24"/>
         </w:rPr>
@@ -618,16 +489,12 @@
     <w:p>
       <w:pPr>
         <w:rPr>
-          <w:b/>
-          <w:bCs/>
-          <w:sz w:val="24"/>
-          <w:szCs w:val="24"/>
-        </w:rPr>
-      </w:pPr>
-      <w:r>
-        <w:rPr>
-          <w:b/>
-          <w:bCs/>
+          <w:sz w:val="24"/>
+          <w:szCs w:val="24"/>
+        </w:rPr>
+      </w:pPr>
+      <w:r>
+        <w:rPr>
           <w:sz w:val="24"/>
           <w:szCs w:val="24"/>
         </w:rPr>
@@ -637,26 +504,20 @@
     <w:p>
       <w:pPr>
         <w:rPr>
-          <w:b/>
-          <w:bCs/>
-          <w:sz w:val="24"/>
-          <w:szCs w:val="24"/>
-        </w:rPr>
-      </w:pPr>
-    </w:p>
-    <w:p>
-      <w:pPr>
-        <w:rPr>
-          <w:b/>
-          <w:bCs/>
-          <w:sz w:val="24"/>
-          <w:szCs w:val="24"/>
-        </w:rPr>
-      </w:pPr>
-      <w:r>
-        <w:rPr>
-          <w:b/>
-          <w:bCs/>
+          <w:sz w:val="24"/>
+          <w:szCs w:val="24"/>
+        </w:rPr>
+      </w:pPr>
+    </w:p>
+    <w:p>
+      <w:pPr>
+        <w:rPr>
+          <w:sz w:val="24"/>
+          <w:szCs w:val="24"/>
+        </w:rPr>
+      </w:pPr>
+      <w:r>
+        <w:rPr>
           <w:sz w:val="24"/>
           <w:szCs w:val="24"/>
         </w:rPr>
@@ -666,16 +527,12 @@
     <w:p>
       <w:pPr>
         <w:rPr>
-          <w:b/>
-          <w:bCs/>
-          <w:sz w:val="24"/>
-          <w:szCs w:val="24"/>
-        </w:rPr>
-      </w:pPr>
-      <w:r>
-        <w:rPr>
-          <w:b/>
-          <w:bCs/>
+          <w:sz w:val="24"/>
+          <w:szCs w:val="24"/>
+        </w:rPr>
+      </w:pPr>
+      <w:r>
+        <w:rPr>
           <w:sz w:val="24"/>
           <w:szCs w:val="24"/>
         </w:rPr>
@@ -685,26 +542,20 @@
     <w:p>
       <w:pPr>
         <w:rPr>
-          <w:b/>
-          <w:bCs/>
-          <w:sz w:val="24"/>
-          <w:szCs w:val="24"/>
-        </w:rPr>
-      </w:pPr>
-    </w:p>
-    <w:p>
-      <w:pPr>
-        <w:rPr>
-          <w:b/>
-          <w:bCs/>
-          <w:sz w:val="24"/>
-          <w:szCs w:val="24"/>
-        </w:rPr>
-      </w:pPr>
-      <w:r>
-        <w:rPr>
-          <w:b/>
-          <w:bCs/>
+          <w:sz w:val="24"/>
+          <w:szCs w:val="24"/>
+        </w:rPr>
+      </w:pPr>
+    </w:p>
+    <w:p>
+      <w:pPr>
+        <w:rPr>
+          <w:sz w:val="24"/>
+          <w:szCs w:val="24"/>
+        </w:rPr>
+      </w:pPr>
+      <w:r>
+        <w:rPr>
           <w:sz w:val="24"/>
           <w:szCs w:val="24"/>
         </w:rPr>
@@ -714,16 +565,12 @@
     <w:p>
       <w:pPr>
         <w:rPr>
-          <w:b/>
-          <w:bCs/>
-          <w:sz w:val="24"/>
-          <w:szCs w:val="24"/>
-        </w:rPr>
-      </w:pPr>
-      <w:r>
-        <w:rPr>
-          <w:b/>
-          <w:bCs/>
+          <w:sz w:val="24"/>
+          <w:szCs w:val="24"/>
+        </w:rPr>
+      </w:pPr>
+      <w:r>
+        <w:rPr>
           <w:sz w:val="24"/>
           <w:szCs w:val="24"/>
         </w:rPr>
@@ -733,26 +580,20 @@
     <w:p>
       <w:pPr>
         <w:rPr>
-          <w:b/>
-          <w:bCs/>
-          <w:sz w:val="24"/>
-          <w:szCs w:val="24"/>
-        </w:rPr>
-      </w:pPr>
-    </w:p>
-    <w:p>
-      <w:pPr>
-        <w:rPr>
-          <w:b/>
-          <w:bCs/>
-          <w:sz w:val="24"/>
-          <w:szCs w:val="24"/>
-        </w:rPr>
-      </w:pPr>
-      <w:r>
-        <w:rPr>
-          <w:b/>
-          <w:bCs/>
+          <w:sz w:val="24"/>
+          <w:szCs w:val="24"/>
+        </w:rPr>
+      </w:pPr>
+    </w:p>
+    <w:p>
+      <w:pPr>
+        <w:rPr>
+          <w:sz w:val="24"/>
+          <w:szCs w:val="24"/>
+        </w:rPr>
+      </w:pPr>
+      <w:r>
+        <w:rPr>
           <w:sz w:val="24"/>
           <w:szCs w:val="24"/>
         </w:rPr>
@@ -762,37 +603,21 @@
     <w:p>
       <w:pPr>
         <w:rPr>
-          <w:b/>
-          <w:bCs/>
-          <w:sz w:val="24"/>
-          <w:szCs w:val="24"/>
-        </w:rPr>
-      </w:pPr>
-      <w:r>
-        <w:rPr>
-          <w:b/>
-          <w:bCs/>
-          <w:sz w:val="24"/>
-          <w:szCs w:val="24"/>
-        </w:rPr>
-        <w:t xml:space="preserve">* **Cierre Positivo (El usuario desea orientación personalizada o responde "SÍ"):** Se le explica que un asesor especializado lo orientará en el registro de </w:t>
-      </w:r>
-      <w:r>
-        <w:rPr>
-          <w:b/>
-          <w:bCs/>
-          <w:sz w:val="24"/>
-          <w:szCs w:val="24"/>
-        </w:rPr>
-        <w:lastRenderedPageBreak/>
-        <w:t>vacantes, búsqueda de personal y certificación de competencias. Acto seguido, el asistente debe solicitarle de forma explícita si desea dejar sus datos de contacto.</w:t>
-      </w:r>
-    </w:p>
-    <w:p>
-      <w:r>
-        <w:rPr>
-          <w:b/>
-          <w:bCs/>
+          <w:sz w:val="24"/>
+          <w:szCs w:val="24"/>
+        </w:rPr>
+      </w:pPr>
+      <w:r>
+        <w:rPr>
+          <w:sz w:val="24"/>
+          <w:szCs w:val="24"/>
+        </w:rPr>
+        <w:t>* **Cierre Positivo (El usuario desea orientación personalizada o responde "SÍ"):** Se le explica que un asesor especializado lo orientará en el registro de vacantes, búsqueda de personal y certificación de competencias. Acto seguido, el asistente debe solicitarle de forma explícita si desea dejar sus datos de contacto.</w:t>
+      </w:r>
+    </w:p>
+    <w:p>
+      <w:r>
+        <w:rPr>
           <w:sz w:val="24"/>
           <w:szCs w:val="24"/>
         </w:rPr>

</xml_diff>